<commit_message>
Gate cheat panels behind a typed code and polish the web build
- Cheat panels are hidden in every build until the code "mutiny" is
  typed, and typing it again hides them. Unlocked by default in the
  Editor, never saved between sessions (new CheatUnlock).
- Release and WebGL builds no longer switch the cheat panel off, since
  the code now handles hiding it.
- Quit buttons are hidden in web builds, where Application.Quit does
  nothing (new WebBuildQuitButtonHider).
- WebGL now uses the Minimal template at 1280 x 720.
- Removed the unused AI Assistant package.
- Updated the HLD and Tech Stack docs and added the itch.io page kit.
</commit_message>
<xml_diff>
--- a/Documentation/Throne of Tides - HLD.docx
+++ b/Documentation/Throne of Tides - HLD.docx
@@ -4476,7 +4476,7 @@
         <w:t xml:space="preserve">In game cheat panels:</w:t>
       </w:r>
       <w:r>
-        <w:t xml:space="preserve"> Available in development builds only. They change HP and mana, add any card to the hand and force the enemy's next card.</w:t>
+        <w:t xml:space="preserve"> Hidden in every build until the cheat code is typed (see CheatUnlock). They change HP and mana, add any card to the hand and force the enemy's next card.</w:t>
       </w:r>
     </w:p>
     <w:p>
@@ -4635,7 +4635,7 @@
                 <w:sz w:val="20"/>
                 <w:szCs w:val="20"/>
               </w:rPr>
-              <w:t xml:space="preserve">Builds the game exactly as set up in the editor, with the profiler, debugger and cheat panels enabled</w:t>
+              <w:t xml:space="preserve">Builds the game exactly as set up in the editor, with the profiler and debugger enabled</w:t>
             </w:r>
           </w:p>
         </w:tc>
@@ -4691,7 +4691,7 @@
                 <w:sz w:val="20"/>
                 <w:szCs w:val="20"/>
               </w:rPr>
-              <w:t xml:space="preserve">Applies the build profile's player deck and disables the cheat panels</w:t>
+              <w:t xml:space="preserve">Applies the build profile's player deck, with no profiler or debugger</w:t>
             </w:r>
           </w:p>
         </w:tc>
@@ -4747,7 +4747,7 @@
                 <w:sz w:val="20"/>
                 <w:szCs w:val="20"/>
               </w:rPr>
-              <w:t xml:space="preserve">Applies the build profile's player deck and temporary config overrides, keeps the cheat panels and restores everything afterward</w:t>
+              <w:t xml:space="preserve">Applies the build profile's player deck and temporary config overrides, then restores everything afterward</w:t>
             </w:r>
           </w:p>
         </w:tc>

</xml_diff>